<commit_message>
HWZ Unterlagen for 2026
</commit_message>
<xml_diff>
--- a/SchulungsUnterlagen/Semesterprogramme/HWZ_Semesterprogramm_Database.docx
+++ b/SchulungsUnterlagen/Semesterprogramme/HWZ_Semesterprogramm_Database.docx
@@ -273,7 +273,7 @@
                 <w:sz w:val="20"/>
                 <w:szCs w:val="20"/>
               </w:rPr>
-              <w:t>3</w:t>
+              <w:t>4</w:t>
             </w:r>
           </w:p>
         </w:tc>
@@ -806,7 +806,39 @@
           <w:sz w:val="20"/>
           <w:szCs w:val="20"/>
         </w:rPr>
-        <w:t>(inkl. Views, Functions and Stored-Procedures)</w:t>
+        <w:t xml:space="preserve">(inkl. Views, </w:t>
+      </w:r>
+      <w:proofErr w:type="spellStart"/>
+      <w:r>
+        <w:rPr>
+          <w:sz w:val="20"/>
+          <w:szCs w:val="20"/>
+        </w:rPr>
+        <w:t>Functions</w:t>
+      </w:r>
+      <w:proofErr w:type="spellEnd"/>
+      <w:r>
+        <w:rPr>
+          <w:sz w:val="20"/>
+          <w:szCs w:val="20"/>
+        </w:rPr>
+        <w:t xml:space="preserve"> and </w:t>
+      </w:r>
+      <w:proofErr w:type="spellStart"/>
+      <w:r>
+        <w:rPr>
+          <w:sz w:val="20"/>
+          <w:szCs w:val="20"/>
+        </w:rPr>
+        <w:t>Stored-Procedures</w:t>
+      </w:r>
+      <w:proofErr w:type="spellEnd"/>
+      <w:r>
+        <w:rPr>
+          <w:sz w:val="20"/>
+          <w:szCs w:val="20"/>
+        </w:rPr>
+        <w:t>)</w:t>
       </w:r>
     </w:p>
     <w:p>
@@ -1034,7 +1066,23 @@
           <w:sz w:val="20"/>
           <w:szCs w:val="20"/>
         </w:rPr>
-        <w:t>eues anhand von Requirements erstellen</w:t>
+        <w:t xml:space="preserve">eues anhand von </w:t>
+      </w:r>
+      <w:proofErr w:type="spellStart"/>
+      <w:r>
+        <w:rPr>
+          <w:sz w:val="20"/>
+          <w:szCs w:val="20"/>
+        </w:rPr>
+        <w:t>Requirements</w:t>
+      </w:r>
+      <w:proofErr w:type="spellEnd"/>
+      <w:r>
+        <w:rPr>
+          <w:sz w:val="20"/>
+          <w:szCs w:val="20"/>
+        </w:rPr>
+        <w:t xml:space="preserve"> erstellen</w:t>
       </w:r>
     </w:p>
     <w:p>
@@ -1055,7 +1103,23 @@
           <w:sz w:val="20"/>
           <w:szCs w:val="20"/>
         </w:rPr>
-        <w:t>können in einem bestehenden Schema (sakila) Abfragen (inkl. Joins) in SQL formulieren</w:t>
+        <w:t>können in einem bestehenden Schema (</w:t>
+      </w:r>
+      <w:proofErr w:type="spellStart"/>
+      <w:r>
+        <w:rPr>
+          <w:sz w:val="20"/>
+          <w:szCs w:val="20"/>
+        </w:rPr>
+        <w:t>sakila</w:t>
+      </w:r>
+      <w:proofErr w:type="spellEnd"/>
+      <w:r>
+        <w:rPr>
+          <w:sz w:val="20"/>
+          <w:szCs w:val="20"/>
+        </w:rPr>
+        <w:t>) Abfragen (inkl. Joins) in SQL formulieren</w:t>
       </w:r>
     </w:p>
     <w:p>
@@ -1111,7 +1175,39 @@
           <w:sz w:val="20"/>
           <w:szCs w:val="20"/>
         </w:rPr>
-        <w:t>können Functions, Views und Stored-Procedures erstellen</w:t>
+        <w:t xml:space="preserve">können </w:t>
+      </w:r>
+      <w:proofErr w:type="spellStart"/>
+      <w:r>
+        <w:rPr>
+          <w:sz w:val="20"/>
+          <w:szCs w:val="20"/>
+        </w:rPr>
+        <w:t>Functions</w:t>
+      </w:r>
+      <w:proofErr w:type="spellEnd"/>
+      <w:r>
+        <w:rPr>
+          <w:sz w:val="20"/>
+          <w:szCs w:val="20"/>
+        </w:rPr>
+        <w:t xml:space="preserve">, Views und </w:t>
+      </w:r>
+      <w:proofErr w:type="spellStart"/>
+      <w:r>
+        <w:rPr>
+          <w:sz w:val="20"/>
+          <w:szCs w:val="20"/>
+        </w:rPr>
+        <w:t>Stored-Procedures</w:t>
+      </w:r>
+      <w:proofErr w:type="spellEnd"/>
+      <w:r>
+        <w:rPr>
+          <w:sz w:val="20"/>
+          <w:szCs w:val="20"/>
+        </w:rPr>
+        <w:t xml:space="preserve"> erstellen</w:t>
       </w:r>
     </w:p>
     <w:p>
@@ -1265,7 +1361,15 @@
           <w:sz w:val="20"/>
           <w:szCs w:val="20"/>
         </w:rPr>
-        <w:t xml:space="preserve"> Basierend auf dem Referenz-Schema (sa</w:t>
+        <w:t xml:space="preserve"> Basierend auf dem Referenz-Schema (</w:t>
+      </w:r>
+      <w:proofErr w:type="spellStart"/>
+      <w:r>
+        <w:rPr>
+          <w:sz w:val="20"/>
+          <w:szCs w:val="20"/>
+        </w:rPr>
+        <w:t>sa</w:t>
       </w:r>
       <w:r>
         <w:rPr>
@@ -1279,7 +1383,15 @@
           <w:sz w:val="20"/>
           <w:szCs w:val="20"/>
         </w:rPr>
-        <w:t xml:space="preserve">ila) </w:t>
+        <w:t>ila</w:t>
+      </w:r>
+      <w:proofErr w:type="spellEnd"/>
+      <w:r>
+        <w:rPr>
+          <w:sz w:val="20"/>
+          <w:szCs w:val="20"/>
+        </w:rPr>
+        <w:t xml:space="preserve">) </w:t>
       </w:r>
       <w:r>
         <w:rPr>
@@ -1413,8 +1525,17 @@
           <w:sz w:val="20"/>
           <w:szCs w:val="20"/>
         </w:rPr>
-        <w:t>Leistungsnachweise via Moodle</w:t>
-      </w:r>
+        <w:t xml:space="preserve">Leistungsnachweise via </w:t>
+      </w:r>
+      <w:proofErr w:type="spellStart"/>
+      <w:r>
+        <w:rPr>
+          <w:sz w:val="20"/>
+          <w:szCs w:val="20"/>
+        </w:rPr>
+        <w:t>Moodle</w:t>
+      </w:r>
+      <w:proofErr w:type="spellEnd"/>
       <w:r>
         <w:rPr>
           <w:sz w:val="20"/>
@@ -1448,8 +1569,17 @@
           <w:sz w:val="20"/>
           <w:szCs w:val="20"/>
         </w:rPr>
-        <w:t>open book</w:t>
-      </w:r>
+        <w:t xml:space="preserve">open </w:t>
+      </w:r>
+      <w:proofErr w:type="spellStart"/>
+      <w:r>
+        <w:rPr>
+          <w:sz w:val="20"/>
+          <w:szCs w:val="20"/>
+        </w:rPr>
+        <w:t>book</w:t>
+      </w:r>
+      <w:proofErr w:type="spellEnd"/>
     </w:p>
     <w:p>
       <w:pPr>
@@ -1650,12 +1780,21 @@
           <w:szCs w:val="20"/>
         </w:rPr>
       </w:pPr>
-      <w:r>
-        <w:rPr>
-          <w:sz w:val="20"/>
-          <w:szCs w:val="20"/>
-        </w:rPr>
-        <w:t>Moodle-Kurs mit Links zu Online-Tutorials</w:t>
+      <w:proofErr w:type="spellStart"/>
+      <w:r>
+        <w:rPr>
+          <w:sz w:val="20"/>
+          <w:szCs w:val="20"/>
+        </w:rPr>
+        <w:t>Moodle</w:t>
+      </w:r>
+      <w:proofErr w:type="spellEnd"/>
+      <w:r>
+        <w:rPr>
+          <w:sz w:val="20"/>
+          <w:szCs w:val="20"/>
+        </w:rPr>
+        <w:t>-Kurs mit Links zu Online-Tutorials</w:t>
       </w:r>
       <w:r>
         <w:br w:type="page"/>
@@ -1811,7 +1950,7 @@
                 <w:sz w:val="20"/>
                 <w:szCs w:val="20"/>
               </w:rPr>
-              <w:t>8</w:t>
+              <w:t>0</w:t>
             </w:r>
             <w:r>
               <w:rPr>
@@ -1819,7 +1958,7 @@
                 <w:sz w:val="20"/>
                 <w:szCs w:val="20"/>
               </w:rPr>
-              <w:t>.3.202</w:t>
+              <w:t>.3.2</w:t>
             </w:r>
             <w:r>
               <w:rPr>
@@ -1827,7 +1966,7 @@
                 <w:sz w:val="20"/>
                 <w:szCs w:val="20"/>
               </w:rPr>
-              <w:t>5</w:t>
+              <w:t>6</w:t>
             </w:r>
           </w:p>
         </w:tc>
@@ -1897,7 +2036,7 @@
                 <w:sz w:val="20"/>
                 <w:szCs w:val="20"/>
               </w:rPr>
-              <w:t>17:30 – 20:45</w:t>
+              <w:t>09:00 – 12:15</w:t>
             </w:r>
           </w:p>
         </w:tc>
@@ -1942,7 +2081,39 @@
           <w:sz w:val="20"/>
           <w:szCs w:val="20"/>
         </w:rPr>
-        <w:t>Installation MySQL inkl sakila Schema</w:t>
+        <w:t xml:space="preserve">Installation MySQL </w:t>
+      </w:r>
+      <w:proofErr w:type="spellStart"/>
+      <w:r>
+        <w:rPr>
+          <w:sz w:val="20"/>
+          <w:szCs w:val="20"/>
+        </w:rPr>
+        <w:t>inkl</w:t>
+      </w:r>
+      <w:proofErr w:type="spellEnd"/>
+      <w:r>
+        <w:rPr>
+          <w:sz w:val="20"/>
+          <w:szCs w:val="20"/>
+        </w:rPr>
+        <w:t xml:space="preserve"> </w:t>
+      </w:r>
+      <w:proofErr w:type="spellStart"/>
+      <w:r>
+        <w:rPr>
+          <w:sz w:val="20"/>
+          <w:szCs w:val="20"/>
+        </w:rPr>
+        <w:t>sakila</w:t>
+      </w:r>
+      <w:proofErr w:type="spellEnd"/>
+      <w:r>
+        <w:rPr>
+          <w:sz w:val="20"/>
+          <w:szCs w:val="20"/>
+        </w:rPr>
+        <w:t xml:space="preserve"> Schema</w:t>
       </w:r>
     </w:p>
     <w:p>
@@ -2002,8 +2173,33 @@
           <w:sz w:val="20"/>
           <w:szCs w:val="20"/>
         </w:rPr>
-        <w:t>Reverse-Engineering von sakila mit der Workbench</w:t>
-      </w:r>
+        <w:t xml:space="preserve">Reverse-Engineering von </w:t>
+      </w:r>
+      <w:proofErr w:type="spellStart"/>
+      <w:r>
+        <w:rPr>
+          <w:sz w:val="20"/>
+          <w:szCs w:val="20"/>
+        </w:rPr>
+        <w:t>sakila</w:t>
+      </w:r>
+      <w:proofErr w:type="spellEnd"/>
+      <w:r>
+        <w:rPr>
+          <w:sz w:val="20"/>
+          <w:szCs w:val="20"/>
+        </w:rPr>
+        <w:t xml:space="preserve"> mit der </w:t>
+      </w:r>
+      <w:proofErr w:type="spellStart"/>
+      <w:r>
+        <w:rPr>
+          <w:sz w:val="20"/>
+          <w:szCs w:val="20"/>
+        </w:rPr>
+        <w:t>Workbench</w:t>
+      </w:r>
+      <w:proofErr w:type="spellEnd"/>
     </w:p>
     <w:p>
       <w:pPr>
@@ -2024,7 +2220,39 @@
           <w:sz w:val="20"/>
           <w:szCs w:val="20"/>
         </w:rPr>
-        <w:t>DDL und DML Aktionen mit Workbench via GUI ausführen</w:t>
+        <w:t xml:space="preserve">DDL und </w:t>
+      </w:r>
+      <w:proofErr w:type="gramStart"/>
+      <w:r>
+        <w:rPr>
+          <w:sz w:val="20"/>
+          <w:szCs w:val="20"/>
+        </w:rPr>
+        <w:t>DML Aktionen</w:t>
+      </w:r>
+      <w:proofErr w:type="gramEnd"/>
+      <w:r>
+        <w:rPr>
+          <w:sz w:val="20"/>
+          <w:szCs w:val="20"/>
+        </w:rPr>
+        <w:t xml:space="preserve"> mit </w:t>
+      </w:r>
+      <w:proofErr w:type="spellStart"/>
+      <w:r>
+        <w:rPr>
+          <w:sz w:val="20"/>
+          <w:szCs w:val="20"/>
+        </w:rPr>
+        <w:t>Workbench</w:t>
+      </w:r>
+      <w:proofErr w:type="spellEnd"/>
+      <w:r>
+        <w:rPr>
+          <w:sz w:val="20"/>
+          <w:szCs w:val="20"/>
+        </w:rPr>
+        <w:t xml:space="preserve"> via GUI ausführen</w:t>
       </w:r>
     </w:p>
     <w:p>
@@ -2094,8 +2322,18 @@
           <w:szCs w:val="20"/>
           <w:lang w:val="en-US"/>
         </w:rPr>
-        <w:t>ERD-Symbolik</w:t>
-      </w:r>
+        <w:t>ERD-</w:t>
+      </w:r>
+      <w:proofErr w:type="spellStart"/>
+      <w:r>
+        <w:rPr>
+          <w:sz w:val="20"/>
+          <w:szCs w:val="20"/>
+          <w:lang w:val="en-US"/>
+        </w:rPr>
+        <w:t>Symbolik</w:t>
+      </w:r>
+      <w:proofErr w:type="spellEnd"/>
     </w:p>
     <w:p>
       <w:pPr>
@@ -2176,7 +2414,23 @@
           <w:sz w:val="20"/>
           <w:szCs w:val="20"/>
         </w:rPr>
-        <w:t>ERD von sakila ergänzen</w:t>
+        <w:t xml:space="preserve">ERD von </w:t>
+      </w:r>
+      <w:proofErr w:type="spellStart"/>
+      <w:r>
+        <w:rPr>
+          <w:sz w:val="20"/>
+          <w:szCs w:val="20"/>
+        </w:rPr>
+        <w:t>sakila</w:t>
+      </w:r>
+      <w:proofErr w:type="spellEnd"/>
+      <w:r>
+        <w:rPr>
+          <w:sz w:val="20"/>
+          <w:szCs w:val="20"/>
+        </w:rPr>
+        <w:t xml:space="preserve"> ergänzen</w:t>
       </w:r>
     </w:p>
     <w:p>
@@ -2348,23 +2602,7 @@
                 <w:sz w:val="20"/>
                 <w:szCs w:val="20"/>
               </w:rPr>
-              <w:t>1</w:t>
-            </w:r>
-            <w:r>
-              <w:rPr>
-                <w:rFonts w:cs="Arial"/>
-                <w:sz w:val="20"/>
-                <w:szCs w:val="20"/>
-              </w:rPr>
-              <w:t>.4.202</w:t>
-            </w:r>
-            <w:r>
-              <w:rPr>
-                <w:rFonts w:cs="Arial"/>
-                <w:sz w:val="20"/>
-                <w:szCs w:val="20"/>
-              </w:rPr>
-              <w:t>5</w:t>
+              <w:t>17.3.2026</w:t>
             </w:r>
           </w:p>
         </w:tc>
@@ -2434,7 +2672,7 @@
                 <w:sz w:val="20"/>
                 <w:szCs w:val="20"/>
               </w:rPr>
-              <w:t>17:30 – 20:45</w:t>
+              <w:t>09:00 – 12:15</w:t>
             </w:r>
           </w:p>
         </w:tc>
@@ -2475,14 +2713,70 @@
           <w:lang w:val="en-US"/>
         </w:rPr>
       </w:pPr>
+      <w:proofErr w:type="spellStart"/>
       <w:r>
         <w:rPr>
           <w:sz w:val="20"/>
           <w:szCs w:val="20"/>
           <w:lang w:val="en-US"/>
         </w:rPr>
-        <w:t>Folien 21 – 29 studieren und Fragen notieren</w:t>
-      </w:r>
+        <w:t>Folien</w:t>
+      </w:r>
+      <w:proofErr w:type="spellEnd"/>
+      <w:r>
+        <w:rPr>
+          <w:sz w:val="20"/>
+          <w:szCs w:val="20"/>
+          <w:lang w:val="en-US"/>
+        </w:rPr>
+        <w:t xml:space="preserve"> 21 – 29 </w:t>
+      </w:r>
+      <w:proofErr w:type="spellStart"/>
+      <w:r>
+        <w:rPr>
+          <w:sz w:val="20"/>
+          <w:szCs w:val="20"/>
+          <w:lang w:val="en-US"/>
+        </w:rPr>
+        <w:t>studieren</w:t>
+      </w:r>
+      <w:proofErr w:type="spellEnd"/>
+      <w:r>
+        <w:rPr>
+          <w:sz w:val="20"/>
+          <w:szCs w:val="20"/>
+          <w:lang w:val="en-US"/>
+        </w:rPr>
+        <w:t xml:space="preserve"> und </w:t>
+      </w:r>
+      <w:proofErr w:type="spellStart"/>
+      <w:r>
+        <w:rPr>
+          <w:sz w:val="20"/>
+          <w:szCs w:val="20"/>
+          <w:lang w:val="en-US"/>
+        </w:rPr>
+        <w:t>Fragen</w:t>
+      </w:r>
+      <w:proofErr w:type="spellEnd"/>
+      <w:r>
+        <w:rPr>
+          <w:sz w:val="20"/>
+          <w:szCs w:val="20"/>
+          <w:lang w:val="en-US"/>
+        </w:rPr>
+        <w:t xml:space="preserve"> </w:t>
+      </w:r>
+      <w:proofErr w:type="spellStart"/>
+      <w:r>
+        <w:rPr>
+          <w:sz w:val="20"/>
+          <w:szCs w:val="20"/>
+          <w:lang w:val="en-US"/>
+        </w:rPr>
+        <w:t>notieren</w:t>
+      </w:r>
+      <w:proofErr w:type="spellEnd"/>
     </w:p>
     <w:p>
       <w:pPr>
@@ -2564,8 +2858,17 @@
           <w:sz w:val="20"/>
           <w:szCs w:val="20"/>
         </w:rPr>
-        <w:t xml:space="preserve"> mit der Workbench</w:t>
-      </w:r>
+        <w:t xml:space="preserve"> mit der </w:t>
+      </w:r>
+      <w:proofErr w:type="spellStart"/>
+      <w:r>
+        <w:rPr>
+          <w:sz w:val="20"/>
+          <w:szCs w:val="20"/>
+        </w:rPr>
+        <w:t>Workbench</w:t>
+      </w:r>
+      <w:proofErr w:type="spellEnd"/>
     </w:p>
     <w:p>
       <w:pPr>
@@ -2581,12 +2884,85 @@
           <w:szCs w:val="20"/>
         </w:rPr>
       </w:pPr>
-      <w:r>
-        <w:rPr>
-          <w:sz w:val="20"/>
-          <w:szCs w:val="20"/>
-        </w:rPr>
-        <w:t>SQL Scripts ausführen (sakila drop and create, Load data)</w:t>
+      <w:proofErr w:type="gramStart"/>
+      <w:r>
+        <w:rPr>
+          <w:sz w:val="20"/>
+          <w:szCs w:val="20"/>
+        </w:rPr>
+        <w:t>SQL Scripts</w:t>
+      </w:r>
+      <w:proofErr w:type="gramEnd"/>
+      <w:r>
+        <w:rPr>
+          <w:sz w:val="20"/>
+          <w:szCs w:val="20"/>
+        </w:rPr>
+        <w:t xml:space="preserve"> ausführen (</w:t>
+      </w:r>
+      <w:proofErr w:type="spellStart"/>
+      <w:r>
+        <w:rPr>
+          <w:sz w:val="20"/>
+          <w:szCs w:val="20"/>
+        </w:rPr>
+        <w:t>sakila</w:t>
+      </w:r>
+      <w:proofErr w:type="spellEnd"/>
+      <w:r>
+        <w:rPr>
+          <w:sz w:val="20"/>
+          <w:szCs w:val="20"/>
+        </w:rPr>
+        <w:t xml:space="preserve"> </w:t>
+      </w:r>
+      <w:proofErr w:type="spellStart"/>
+      <w:r>
+        <w:rPr>
+          <w:sz w:val="20"/>
+          <w:szCs w:val="20"/>
+        </w:rPr>
+        <w:t>drop</w:t>
+      </w:r>
+      <w:proofErr w:type="spellEnd"/>
+      <w:r>
+        <w:rPr>
+          <w:sz w:val="20"/>
+          <w:szCs w:val="20"/>
+        </w:rPr>
+        <w:t xml:space="preserve"> and </w:t>
+      </w:r>
+      <w:proofErr w:type="spellStart"/>
+      <w:r>
+        <w:rPr>
+          <w:sz w:val="20"/>
+          <w:szCs w:val="20"/>
+        </w:rPr>
+        <w:t>create</w:t>
+      </w:r>
+      <w:proofErr w:type="spellEnd"/>
+      <w:r>
+        <w:rPr>
+          <w:sz w:val="20"/>
+          <w:szCs w:val="20"/>
+        </w:rPr>
+        <w:t xml:space="preserve">, Load </w:t>
+      </w:r>
+      <w:proofErr w:type="spellStart"/>
+      <w:r>
+        <w:rPr>
+          <w:sz w:val="20"/>
+          <w:szCs w:val="20"/>
+        </w:rPr>
+        <w:t>data</w:t>
+      </w:r>
+      <w:proofErr w:type="spellEnd"/>
+      <w:r>
+        <w:rPr>
+          <w:sz w:val="20"/>
+          <w:szCs w:val="20"/>
+        </w:rPr>
+        <w:t>)</w:t>
       </w:r>
     </w:p>
     <w:p>
@@ -2624,6 +3000,7 @@
           <w:szCs w:val="20"/>
         </w:rPr>
       </w:pPr>
+      <w:proofErr w:type="gramStart"/>
       <w:r>
         <w:rPr>
           <w:sz w:val="20"/>
@@ -2631,6 +3008,7 @@
         </w:rPr>
         <w:t>AS Alias</w:t>
       </w:r>
+      <w:proofErr w:type="gramEnd"/>
     </w:p>
     <w:p>
       <w:pPr>
@@ -2681,7 +3059,25 @@
           <w:szCs w:val="20"/>
           <w:lang w:val="en-US"/>
         </w:rPr>
-        <w:t>(= und !=, LIKE, NOT NULL, NOT IN, BETWEEN, REGEXP BINARY, AND, OR)</w:t>
+        <w:t xml:space="preserve">(= </w:t>
+      </w:r>
+      <w:proofErr w:type="gramStart"/>
+      <w:r>
+        <w:rPr>
+          <w:sz w:val="18"/>
+          <w:szCs w:val="20"/>
+          <w:lang w:val="en-US"/>
+        </w:rPr>
+        <w:t>und !</w:t>
+      </w:r>
+      <w:proofErr w:type="gramEnd"/>
+      <w:r>
+        <w:rPr>
+          <w:sz w:val="18"/>
+          <w:szCs w:val="20"/>
+          <w:lang w:val="en-US"/>
+        </w:rPr>
+        <w:t>=, LIKE, NOT NULL, NOT IN, BETWEEN, REGEXP BINARY, AND, OR)</w:t>
       </w:r>
     </w:p>
     <w:p>
@@ -2697,6 +3093,7 @@
           <w:szCs w:val="20"/>
         </w:rPr>
       </w:pPr>
+      <w:proofErr w:type="spellStart"/>
       <w:r>
         <w:rPr>
           <w:sz w:val="20"/>
@@ -2704,6 +3101,7 @@
         </w:rPr>
         <w:t>Functions</w:t>
       </w:r>
+      <w:proofErr w:type="spellEnd"/>
       <w:r>
         <w:rPr>
           <w:sz w:val="20"/>
@@ -2819,7 +3217,25 @@
           <w:sz w:val="20"/>
           <w:szCs w:val="20"/>
         </w:rPr>
-        <w:t xml:space="preserve"> (Select, Functions, Meta-Data)</w:t>
+        <w:t xml:space="preserve"> (Select, </w:t>
+      </w:r>
+      <w:proofErr w:type="spellStart"/>
+      <w:r>
+        <w:rPr>
+          <w:bCs/>
+          <w:sz w:val="20"/>
+          <w:szCs w:val="20"/>
+        </w:rPr>
+        <w:t>Functions</w:t>
+      </w:r>
+      <w:proofErr w:type="spellEnd"/>
+      <w:r>
+        <w:rPr>
+          <w:bCs/>
+          <w:sz w:val="20"/>
+          <w:szCs w:val="20"/>
+        </w:rPr>
+        <w:t>, Meta-Data)</w:t>
       </w:r>
     </w:p>
     <w:p>
@@ -2923,6 +3339,7 @@
               </w:rPr>
               <w:t xml:space="preserve">Normalisierung / </w:t>
             </w:r>
+            <w:proofErr w:type="spellStart"/>
             <w:r>
               <w:rPr>
                 <w:rFonts w:cs="Arial"/>
@@ -2930,7 +3347,17 @@
                 <w:sz w:val="20"/>
                 <w:szCs w:val="20"/>
               </w:rPr>
-              <w:t xml:space="preserve">Inner Joins / </w:t>
+              <w:t>Inner</w:t>
+            </w:r>
+            <w:proofErr w:type="spellEnd"/>
+            <w:r>
+              <w:rPr>
+                <w:rFonts w:cs="Arial"/>
+                <w:b/>
+                <w:sz w:val="20"/>
+                <w:szCs w:val="20"/>
+              </w:rPr>
+              <w:t xml:space="preserve"> Joins / </w:t>
             </w:r>
             <w:r>
               <w:rPr>
@@ -3016,47 +3443,7 @@
                 <w:sz w:val="20"/>
                 <w:szCs w:val="20"/>
               </w:rPr>
-              <w:t>D</w:t>
-            </w:r>
-            <w:r>
-              <w:rPr>
-                <w:rFonts w:cs="Arial"/>
-                <w:sz w:val="20"/>
-                <w:szCs w:val="20"/>
-              </w:rPr>
-              <w:t>o</w:t>
-            </w:r>
-            <w:r>
-              <w:rPr>
-                <w:rFonts w:cs="Arial"/>
-                <w:sz w:val="20"/>
-                <w:szCs w:val="20"/>
-              </w:rPr>
-              <w:t xml:space="preserve"> </w:t>
-            </w:r>
-            <w:r>
-              <w:rPr>
-                <w:rFonts w:cs="Arial"/>
-                <w:sz w:val="20"/>
-                <w:szCs w:val="20"/>
-              </w:rPr>
-              <w:t>10</w:t>
-            </w:r>
-            <w:r>
-              <w:rPr>
-                <w:rFonts w:cs="Arial"/>
-                <w:sz w:val="20"/>
-                <w:szCs w:val="20"/>
-              </w:rPr>
-              <w:t>.4.202</w:t>
-            </w:r>
-            <w:r>
-              <w:rPr>
-                <w:rFonts w:cs="Arial"/>
-                <w:sz w:val="20"/>
-                <w:szCs w:val="20"/>
-              </w:rPr>
-              <w:t>5</w:t>
+              <w:t>Di 24.3.2026</w:t>
             </w:r>
           </w:p>
         </w:tc>
@@ -3114,7 +3501,7 @@
               <w:spacing w:before="60" w:after="60" w:line="240" w:lineRule="auto"/>
               <w:rPr>
                 <w:rFonts w:cs="Arial"/>
-                <w:b/>
+                <w:bCs/>
                 <w:sz w:val="20"/>
                 <w:szCs w:val="20"/>
               </w:rPr>
@@ -3122,7 +3509,7 @@
             <w:r>
               <w:rPr>
                 <w:rFonts w:cs="Arial"/>
-                <w:b/>
+                <w:bCs/>
                 <w:sz w:val="20"/>
                 <w:szCs w:val="20"/>
               </w:rPr>
@@ -3269,12 +3656,21 @@
           <w:szCs w:val="20"/>
         </w:rPr>
       </w:pPr>
-      <w:r>
-        <w:rPr>
-          <w:sz w:val="20"/>
-          <w:szCs w:val="20"/>
-        </w:rPr>
-        <w:t>Inner Joins</w:t>
+      <w:proofErr w:type="spellStart"/>
+      <w:r>
+        <w:rPr>
+          <w:sz w:val="20"/>
+          <w:szCs w:val="20"/>
+        </w:rPr>
+        <w:t>Inner</w:t>
+      </w:r>
+      <w:proofErr w:type="spellEnd"/>
+      <w:r>
+        <w:rPr>
+          <w:sz w:val="20"/>
+          <w:szCs w:val="20"/>
+        </w:rPr>
+        <w:t xml:space="preserve"> Joins</w:t>
       </w:r>
     </w:p>
     <w:p>
@@ -3377,7 +3773,25 @@
           <w:sz w:val="20"/>
           <w:szCs w:val="20"/>
         </w:rPr>
-        <w:t xml:space="preserve"> (Joins, SubQueries)</w:t>
+        <w:t xml:space="preserve"> (Joins, </w:t>
+      </w:r>
+      <w:proofErr w:type="spellStart"/>
+      <w:r>
+        <w:rPr>
+          <w:bCs/>
+          <w:sz w:val="20"/>
+          <w:szCs w:val="20"/>
+        </w:rPr>
+        <w:t>SubQueries</w:t>
+      </w:r>
+      <w:proofErr w:type="spellEnd"/>
+      <w:r>
+        <w:rPr>
+          <w:bCs/>
+          <w:sz w:val="20"/>
+          <w:szCs w:val="20"/>
+        </w:rPr>
+        <w:t>)</w:t>
       </w:r>
     </w:p>
     <w:p>
@@ -3400,7 +3814,25 @@
           <w:sz w:val="20"/>
           <w:szCs w:val="20"/>
         </w:rPr>
-        <w:t>Select mit Inner-Join erstellen (Adressliste der Angestellten)</w:t>
+        <w:t>Select mit Inner-</w:t>
+      </w:r>
+      <w:proofErr w:type="spellStart"/>
+      <w:r>
+        <w:rPr>
+          <w:color w:val="auto"/>
+          <w:sz w:val="20"/>
+          <w:szCs w:val="20"/>
+        </w:rPr>
+        <w:t>Join</w:t>
+      </w:r>
+      <w:proofErr w:type="spellEnd"/>
+      <w:r>
+        <w:rPr>
+          <w:color w:val="auto"/>
+          <w:sz w:val="20"/>
+          <w:szCs w:val="20"/>
+        </w:rPr>
+        <w:t xml:space="preserve"> erstellen (Adressliste der Angestellten)</w:t>
       </w:r>
     </w:p>
     <w:p>
@@ -3423,7 +3855,25 @@
           <w:sz w:val="20"/>
           <w:szCs w:val="20"/>
         </w:rPr>
-        <w:t>Eigene Person als Mitarbeiter mit Workbench erfassen und SQL analysieren</w:t>
+        <w:t xml:space="preserve">Eigene Person als Mitarbeiter mit </w:t>
+      </w:r>
+      <w:proofErr w:type="spellStart"/>
+      <w:r>
+        <w:rPr>
+          <w:color w:val="auto"/>
+          <w:sz w:val="20"/>
+          <w:szCs w:val="20"/>
+        </w:rPr>
+        <w:t>Workbench</w:t>
+      </w:r>
+      <w:proofErr w:type="spellEnd"/>
+      <w:r>
+        <w:rPr>
+          <w:color w:val="auto"/>
+          <w:sz w:val="20"/>
+          <w:szCs w:val="20"/>
+        </w:rPr>
+        <w:t xml:space="preserve"> erfassen und SQL analysieren</w:t>
       </w:r>
     </w:p>
     <w:p>
@@ -3445,7 +3895,39 @@
           <w:sz w:val="20"/>
           <w:szCs w:val="20"/>
         </w:rPr>
-        <w:t>3 weitere Sprachen in sakila definieren und bei 10 Filmen die Originalsprache setzen (via Scripts und Workbench)</w:t>
+        <w:t xml:space="preserve">3 weitere Sprachen in </w:t>
+      </w:r>
+      <w:proofErr w:type="spellStart"/>
+      <w:r>
+        <w:rPr>
+          <w:sz w:val="20"/>
+          <w:szCs w:val="20"/>
+        </w:rPr>
+        <w:t>sakila</w:t>
+      </w:r>
+      <w:proofErr w:type="spellEnd"/>
+      <w:r>
+        <w:rPr>
+          <w:sz w:val="20"/>
+          <w:szCs w:val="20"/>
+        </w:rPr>
+        <w:t xml:space="preserve"> definieren und bei 10 Filmen die Originalsprache setzen (via Scripts und </w:t>
+      </w:r>
+      <w:proofErr w:type="spellStart"/>
+      <w:r>
+        <w:rPr>
+          <w:sz w:val="20"/>
+          <w:szCs w:val="20"/>
+        </w:rPr>
+        <w:t>Workbench</w:t>
+      </w:r>
+      <w:proofErr w:type="spellEnd"/>
+      <w:r>
+        <w:rPr>
+          <w:sz w:val="20"/>
+          <w:szCs w:val="20"/>
+        </w:rPr>
+        <w:t>)</w:t>
       </w:r>
       <w:r>
         <w:rPr>
@@ -3545,7 +4027,29 @@
                 <w:szCs w:val="20"/>
                 <w:lang w:val="en-US"/>
               </w:rPr>
-              <w:t>: Transaktionen, Functions, Stored-Procedures</w:t>
+              <w:t xml:space="preserve">: </w:t>
+            </w:r>
+            <w:proofErr w:type="spellStart"/>
+            <w:r>
+              <w:rPr>
+                <w:rFonts w:cs="Arial"/>
+                <w:b/>
+                <w:sz w:val="20"/>
+                <w:szCs w:val="20"/>
+                <w:lang w:val="en-US"/>
+              </w:rPr>
+              <w:t>Transaktionen</w:t>
+            </w:r>
+            <w:proofErr w:type="spellEnd"/>
+            <w:r>
+              <w:rPr>
+                <w:rFonts w:cs="Arial"/>
+                <w:b/>
+                <w:sz w:val="20"/>
+                <w:szCs w:val="20"/>
+                <w:lang w:val="en-US"/>
+              </w:rPr>
+              <w:t>, Functions, Stored-Procedures</w:t>
             </w:r>
           </w:p>
         </w:tc>
@@ -3621,15 +4125,7 @@
                 <w:sz w:val="20"/>
                 <w:szCs w:val="20"/>
               </w:rPr>
-              <w:t>1</w:t>
-            </w:r>
-            <w:r>
-              <w:rPr>
-                <w:rFonts w:cs="Arial"/>
-                <w:sz w:val="20"/>
-                <w:szCs w:val="20"/>
-              </w:rPr>
-              <w:t>0</w:t>
+              <w:t>2</w:t>
             </w:r>
             <w:r>
               <w:rPr>
@@ -3645,7 +4141,7 @@
                 <w:sz w:val="20"/>
                 <w:szCs w:val="20"/>
               </w:rPr>
-              <w:t>5</w:t>
+              <w:t>6</w:t>
             </w:r>
           </w:p>
         </w:tc>
@@ -3715,34 +4211,7 @@
                 <w:sz w:val="20"/>
                 <w:szCs w:val="20"/>
               </w:rPr>
-              <w:t>1</w:t>
-            </w:r>
-            <w:r>
-              <w:rPr>
-                <w:rFonts w:cs="Arial"/>
-                <w:b/>
-                <w:sz w:val="20"/>
-                <w:szCs w:val="20"/>
-              </w:rPr>
-              <w:t>3:15</w:t>
-            </w:r>
-            <w:r>
-              <w:rPr>
-                <w:rFonts w:cs="Arial"/>
-                <w:b/>
-                <w:sz w:val="20"/>
-                <w:szCs w:val="20"/>
-              </w:rPr>
-              <w:t xml:space="preserve"> – </w:t>
-            </w:r>
-            <w:r>
-              <w:rPr>
-                <w:rFonts w:cs="Arial"/>
-                <w:b/>
-                <w:sz w:val="20"/>
-                <w:szCs w:val="20"/>
-              </w:rPr>
-              <w:t>16:30</w:t>
+              <w:t>17:30 – 20:45</w:t>
             </w:r>
           </w:p>
         </w:tc>
@@ -3809,7 +4278,23 @@
           <w:sz w:val="20"/>
           <w:szCs w:val="20"/>
         </w:rPr>
-        <w:t>Was sind die Software-Engineering Überlegungen hinter Functions and Procedures in einer DB?</w:t>
+        <w:t xml:space="preserve">Was sind die Software-Engineering Überlegungen hinter Functions and </w:t>
+      </w:r>
+      <w:proofErr w:type="spellStart"/>
+      <w:r>
+        <w:rPr>
+          <w:sz w:val="20"/>
+          <w:szCs w:val="20"/>
+        </w:rPr>
+        <w:t>Procedures</w:t>
+      </w:r>
+      <w:proofErr w:type="spellEnd"/>
+      <w:r>
+        <w:rPr>
+          <w:sz w:val="20"/>
+          <w:szCs w:val="20"/>
+        </w:rPr>
+        <w:t xml:space="preserve"> in einer DB?</w:t>
       </w:r>
     </w:p>
     <w:p>
@@ -3831,7 +4316,39 @@
           <w:sz w:val="20"/>
           <w:szCs w:val="20"/>
         </w:rPr>
-        <w:t>Wie werden Functions und Proceduren in MySQL geschrieben, getestet und verwendet.</w:t>
+        <w:t xml:space="preserve">Wie werden </w:t>
+      </w:r>
+      <w:proofErr w:type="spellStart"/>
+      <w:r>
+        <w:rPr>
+          <w:sz w:val="20"/>
+          <w:szCs w:val="20"/>
+        </w:rPr>
+        <w:t>Functions</w:t>
+      </w:r>
+      <w:proofErr w:type="spellEnd"/>
+      <w:r>
+        <w:rPr>
+          <w:sz w:val="20"/>
+          <w:szCs w:val="20"/>
+        </w:rPr>
+        <w:t xml:space="preserve"> und </w:t>
+      </w:r>
+      <w:proofErr w:type="spellStart"/>
+      <w:r>
+        <w:rPr>
+          <w:sz w:val="20"/>
+          <w:szCs w:val="20"/>
+        </w:rPr>
+        <w:t>Proceduren</w:t>
+      </w:r>
+      <w:proofErr w:type="spellEnd"/>
+      <w:r>
+        <w:rPr>
+          <w:sz w:val="20"/>
+          <w:szCs w:val="20"/>
+        </w:rPr>
+        <w:t xml:space="preserve"> in MySQL geschrieben, getestet und verwendet.</w:t>
       </w:r>
     </w:p>
     <w:p>
@@ -3904,7 +4421,23 @@
           <w:sz w:val="20"/>
           <w:szCs w:val="20"/>
         </w:rPr>
-        <w:t>Eigene Functions definieren und aufrufen</w:t>
+        <w:t xml:space="preserve">Eigene </w:t>
+      </w:r>
+      <w:proofErr w:type="spellStart"/>
+      <w:r>
+        <w:rPr>
+          <w:sz w:val="20"/>
+          <w:szCs w:val="20"/>
+        </w:rPr>
+        <w:t>Functions</w:t>
+      </w:r>
+      <w:proofErr w:type="spellEnd"/>
+      <w:r>
+        <w:rPr>
+          <w:sz w:val="20"/>
+          <w:szCs w:val="20"/>
+        </w:rPr>
+        <w:t xml:space="preserve"> definieren und aufrufen</w:t>
       </w:r>
     </w:p>
     <w:p>
@@ -3926,7 +4459,23 @@
           <w:sz w:val="20"/>
           <w:szCs w:val="20"/>
         </w:rPr>
-        <w:t>Eigene Proceduren definieren und aufrufen</w:t>
+        <w:t xml:space="preserve">Eigene </w:t>
+      </w:r>
+      <w:proofErr w:type="spellStart"/>
+      <w:r>
+        <w:rPr>
+          <w:sz w:val="20"/>
+          <w:szCs w:val="20"/>
+        </w:rPr>
+        <w:t>Proceduren</w:t>
+      </w:r>
+      <w:proofErr w:type="spellEnd"/>
+      <w:r>
+        <w:rPr>
+          <w:sz w:val="20"/>
+          <w:szCs w:val="20"/>
+        </w:rPr>
+        <w:t xml:space="preserve"> definieren und aufrufen</w:t>
       </w:r>
     </w:p>
     <w:p>
@@ -4185,7 +4734,7 @@
                 <w:sz w:val="20"/>
                 <w:szCs w:val="20"/>
               </w:rPr>
-              <w:t xml:space="preserve">Do </w:t>
+              <w:t>D</w:t>
             </w:r>
             <w:r>
               <w:rPr>
@@ -4193,23 +4742,7 @@
                 <w:sz w:val="20"/>
                 <w:szCs w:val="20"/>
               </w:rPr>
-              <w:t>8</w:t>
-            </w:r>
-            <w:r>
-              <w:rPr>
-                <w:rFonts w:cs="Arial"/>
-                <w:sz w:val="20"/>
-                <w:szCs w:val="20"/>
-              </w:rPr>
-              <w:t>.5.202</w:t>
-            </w:r>
-            <w:r>
-              <w:rPr>
-                <w:rFonts w:cs="Arial"/>
-                <w:sz w:val="20"/>
-                <w:szCs w:val="20"/>
-              </w:rPr>
-              <w:t>5</w:t>
+              <w:t>i 19.5.2026</w:t>
             </w:r>
           </w:p>
         </w:tc>
@@ -4279,34 +4812,7 @@
                 <w:sz w:val="20"/>
                 <w:szCs w:val="20"/>
               </w:rPr>
-              <w:t>09:00</w:t>
-            </w:r>
-            <w:r>
-              <w:rPr>
-                <w:rFonts w:cs="Arial"/>
-                <w:b/>
-                <w:sz w:val="20"/>
-                <w:szCs w:val="20"/>
-              </w:rPr>
-              <w:t xml:space="preserve"> – </w:t>
-            </w:r>
-            <w:r>
-              <w:rPr>
-                <w:rFonts w:cs="Arial"/>
-                <w:b/>
-                <w:sz w:val="20"/>
-                <w:szCs w:val="20"/>
-              </w:rPr>
-              <w:t>12:1</w:t>
-            </w:r>
-            <w:r>
-              <w:rPr>
-                <w:rFonts w:cs="Arial"/>
-                <w:b/>
-                <w:sz w:val="20"/>
-                <w:szCs w:val="20"/>
-              </w:rPr>
-              <w:t>5</w:t>
+              <w:t>09:00 – 12:15</w:t>
             </w:r>
           </w:p>
         </w:tc>
@@ -4355,13 +4861,23 @@
           <w:szCs w:val="20"/>
         </w:rPr>
       </w:pPr>
+      <w:proofErr w:type="spellStart"/>
       <w:r>
         <w:rPr>
           <w:color w:val="auto"/>
           <w:sz w:val="20"/>
           <w:szCs w:val="20"/>
         </w:rPr>
-        <w:t>Moodle-Prüfung</w:t>
+        <w:t>Moodle</w:t>
+      </w:r>
+      <w:proofErr w:type="spellEnd"/>
+      <w:r>
+        <w:rPr>
+          <w:color w:val="auto"/>
+          <w:sz w:val="20"/>
+          <w:szCs w:val="20"/>
+        </w:rPr>
+        <w:t>-Prüfung</w:t>
       </w:r>
       <w:r>
         <w:rPr>
@@ -4439,7 +4955,43 @@
           <w:sz w:val="20"/>
           <w:szCs w:val="20"/>
         </w:rPr>
-        <w:t>Select mit Where-Clauses und Function-Calls</w:t>
+        <w:t xml:space="preserve">Select mit </w:t>
+      </w:r>
+      <w:proofErr w:type="spellStart"/>
+      <w:r>
+        <w:rPr>
+          <w:color w:val="auto"/>
+          <w:sz w:val="20"/>
+          <w:szCs w:val="20"/>
+        </w:rPr>
+        <w:t>Where-Clauses</w:t>
+      </w:r>
+      <w:proofErr w:type="spellEnd"/>
+      <w:r>
+        <w:rPr>
+          <w:color w:val="auto"/>
+          <w:sz w:val="20"/>
+          <w:szCs w:val="20"/>
+        </w:rPr>
+        <w:t xml:space="preserve"> und </w:t>
+      </w:r>
+      <w:proofErr w:type="spellStart"/>
+      <w:r>
+        <w:rPr>
+          <w:color w:val="auto"/>
+          <w:sz w:val="20"/>
+          <w:szCs w:val="20"/>
+        </w:rPr>
+        <w:t>Function</w:t>
+      </w:r>
+      <w:proofErr w:type="spellEnd"/>
+      <w:r>
+        <w:rPr>
+          <w:color w:val="auto"/>
+          <w:sz w:val="20"/>
+          <w:szCs w:val="20"/>
+        </w:rPr>
+        <w:t>-Calls</w:t>
       </w:r>
     </w:p>
     <w:p>
@@ -4462,7 +5014,25 @@
           <w:sz w:val="20"/>
           <w:szCs w:val="20"/>
         </w:rPr>
-        <w:t>Date und Timestamp Formatierung</w:t>
+        <w:t xml:space="preserve">Date und </w:t>
+      </w:r>
+      <w:proofErr w:type="spellStart"/>
+      <w:r>
+        <w:rPr>
+          <w:color w:val="auto"/>
+          <w:sz w:val="20"/>
+          <w:szCs w:val="20"/>
+        </w:rPr>
+        <w:t>Timestamp</w:t>
+      </w:r>
+      <w:proofErr w:type="spellEnd"/>
+      <w:r>
+        <w:rPr>
+          <w:color w:val="auto"/>
+          <w:sz w:val="20"/>
+          <w:szCs w:val="20"/>
+        </w:rPr>
+        <w:t xml:space="preserve"> Formatierung</w:t>
       </w:r>
     </w:p>
     <w:p>
@@ -4479,13 +5049,23 @@
           <w:szCs w:val="20"/>
         </w:rPr>
       </w:pPr>
+      <w:proofErr w:type="spellStart"/>
       <w:r>
         <w:rPr>
           <w:color w:val="auto"/>
           <w:sz w:val="20"/>
           <w:szCs w:val="20"/>
         </w:rPr>
-        <w:t>Inner und Outer Joins</w:t>
+        <w:t>Inner</w:t>
+      </w:r>
+      <w:proofErr w:type="spellEnd"/>
+      <w:r>
+        <w:rPr>
+          <w:color w:val="auto"/>
+          <w:sz w:val="20"/>
+          <w:szCs w:val="20"/>
+        </w:rPr>
+        <w:t xml:space="preserve"> und Outer Joins</w:t>
       </w:r>
     </w:p>
     <w:p>
@@ -4535,14 +5115,30 @@
           <w:sz w:val="20"/>
           <w:szCs w:val="20"/>
         </w:rPr>
-        <w:t xml:space="preserve"> nach vorgegebenen Requirement</w:t>
-      </w:r>
-      <w:r>
-        <w:rPr>
-          <w:sz w:val="20"/>
-          <w:szCs w:val="20"/>
-        </w:rPr>
-        <w:t xml:space="preserve">s </w:t>
+        <w:t xml:space="preserve"> nach vorgegebenen </w:t>
+      </w:r>
+      <w:proofErr w:type="spellStart"/>
+      <w:r>
+        <w:rPr>
+          <w:sz w:val="20"/>
+          <w:szCs w:val="20"/>
+        </w:rPr>
+        <w:t>Requirement</w:t>
+      </w:r>
+      <w:r>
+        <w:rPr>
+          <w:sz w:val="20"/>
+          <w:szCs w:val="20"/>
+        </w:rPr>
+        <w:t>s</w:t>
+      </w:r>
+      <w:proofErr w:type="spellEnd"/>
+      <w:r>
+        <w:rPr>
+          <w:sz w:val="20"/>
+          <w:szCs w:val="20"/>
+        </w:rPr>
+        <w:t xml:space="preserve"> </w:t>
       </w:r>
       <w:r>
         <w:rPr>
@@ -4811,47 +5407,7 @@
                 <w:sz w:val="20"/>
                 <w:szCs w:val="20"/>
               </w:rPr>
-              <w:t>o</w:t>
-            </w:r>
-            <w:r>
-              <w:rPr>
-                <w:rFonts w:cs="Arial"/>
-                <w:sz w:val="20"/>
-                <w:szCs w:val="20"/>
-              </w:rPr>
-              <w:t xml:space="preserve"> </w:t>
-            </w:r>
-            <w:r>
-              <w:rPr>
-                <w:rFonts w:cs="Arial"/>
-                <w:sz w:val="20"/>
-                <w:szCs w:val="20"/>
-              </w:rPr>
-              <w:t>8</w:t>
-            </w:r>
-            <w:r>
-              <w:rPr>
-                <w:rFonts w:cs="Arial"/>
-                <w:sz w:val="20"/>
-                <w:szCs w:val="20"/>
-              </w:rPr>
-              <w:t>.5</w:t>
-            </w:r>
-            <w:r>
-              <w:rPr>
-                <w:rFonts w:cs="Arial"/>
-                <w:sz w:val="20"/>
-                <w:szCs w:val="20"/>
-              </w:rPr>
-              <w:t>.202</w:t>
-            </w:r>
-            <w:r>
-              <w:rPr>
-                <w:rFonts w:cs="Arial"/>
-                <w:sz w:val="20"/>
-                <w:szCs w:val="20"/>
-              </w:rPr>
-              <w:t>5</w:t>
+              <w:t>i 2.6.2026</w:t>
             </w:r>
           </w:p>
         </w:tc>
@@ -4921,7 +5477,7 @@
                 <w:sz w:val="20"/>
                 <w:szCs w:val="20"/>
               </w:rPr>
-              <w:t>13:15 – 16:30</w:t>
+              <w:t>09:00 – 12:15</w:t>
             </w:r>
           </w:p>
         </w:tc>
@@ -4961,12 +5517,37 @@
           <w:szCs w:val="20"/>
         </w:rPr>
       </w:pPr>
-      <w:r>
-        <w:rPr>
-          <w:sz w:val="20"/>
-          <w:szCs w:val="20"/>
-        </w:rPr>
-        <w:t>DDL Befehle (CRUD Operationen auf Meta-Data)</w:t>
+      <w:proofErr w:type="gramStart"/>
+      <w:r>
+        <w:rPr>
+          <w:sz w:val="20"/>
+          <w:szCs w:val="20"/>
+        </w:rPr>
+        <w:t>DDL Befehle</w:t>
+      </w:r>
+      <w:proofErr w:type="gramEnd"/>
+      <w:r>
+        <w:rPr>
+          <w:sz w:val="20"/>
+          <w:szCs w:val="20"/>
+        </w:rPr>
+        <w:t xml:space="preserve"> (</w:t>
+      </w:r>
+      <w:proofErr w:type="gramStart"/>
+      <w:r>
+        <w:rPr>
+          <w:sz w:val="20"/>
+          <w:szCs w:val="20"/>
+        </w:rPr>
+        <w:t>CRUD Operationen</w:t>
+      </w:r>
+      <w:proofErr w:type="gramEnd"/>
+      <w:r>
+        <w:rPr>
+          <w:sz w:val="20"/>
+          <w:szCs w:val="20"/>
+        </w:rPr>
+        <w:t xml:space="preserve"> auf Meta-Data)</w:t>
       </w:r>
     </w:p>
     <w:p>
@@ -5373,31 +5954,7 @@
                 <w:sz w:val="20"/>
                 <w:szCs w:val="20"/>
               </w:rPr>
-              <w:t>2</w:t>
-            </w:r>
-            <w:r>
-              <w:rPr>
-                <w:rFonts w:cs="Arial"/>
-                <w:sz w:val="20"/>
-                <w:szCs w:val="20"/>
-              </w:rPr>
-              <w:t>0</w:t>
-            </w:r>
-            <w:r>
-              <w:rPr>
-                <w:rFonts w:cs="Arial"/>
-                <w:sz w:val="20"/>
-                <w:szCs w:val="20"/>
-              </w:rPr>
-              <w:t>.5.202</w:t>
-            </w:r>
-            <w:r>
-              <w:rPr>
-                <w:rFonts w:cs="Arial"/>
-                <w:sz w:val="20"/>
-                <w:szCs w:val="20"/>
-              </w:rPr>
-              <w:t>5</w:t>
+              <w:t>16.6.2026</w:t>
             </w:r>
           </w:p>
         </w:tc>
@@ -5467,34 +6024,7 @@
                 <w:sz w:val="20"/>
                 <w:szCs w:val="20"/>
               </w:rPr>
-              <w:t>1</w:t>
-            </w:r>
-            <w:r>
-              <w:rPr>
-                <w:rFonts w:cs="Arial"/>
-                <w:b/>
-                <w:sz w:val="20"/>
-                <w:szCs w:val="20"/>
-              </w:rPr>
-              <w:t>7:30</w:t>
-            </w:r>
-            <w:r>
-              <w:rPr>
-                <w:rFonts w:cs="Arial"/>
-                <w:b/>
-                <w:sz w:val="20"/>
-                <w:szCs w:val="20"/>
-              </w:rPr>
-              <w:t xml:space="preserve"> – </w:t>
-            </w:r>
-            <w:r>
-              <w:rPr>
-                <w:rFonts w:cs="Arial"/>
-                <w:b/>
-                <w:sz w:val="20"/>
-                <w:szCs w:val="20"/>
-              </w:rPr>
-              <w:t>20:45</w:t>
+              <w:t>09:00 – 12:15</w:t>
             </w:r>
           </w:p>
         </w:tc>
@@ -5621,7 +6151,71 @@
           <w:sz w:val="20"/>
           <w:szCs w:val="20"/>
         </w:rPr>
-        <w:t>2 Applikations-User für eigenes Schema (Manager: read/write auf alles, Normal: Access nur auf Views und Procedures) definieren.</w:t>
+        <w:t xml:space="preserve">2 Applikations-User für eigenes Schema (Manager: </w:t>
+      </w:r>
+      <w:proofErr w:type="spellStart"/>
+      <w:r>
+        <w:rPr>
+          <w:sz w:val="20"/>
+          <w:szCs w:val="20"/>
+        </w:rPr>
+        <w:t>read</w:t>
+      </w:r>
+      <w:proofErr w:type="spellEnd"/>
+      <w:r>
+        <w:rPr>
+          <w:sz w:val="20"/>
+          <w:szCs w:val="20"/>
+        </w:rPr>
+        <w:t>/</w:t>
+      </w:r>
+      <w:proofErr w:type="spellStart"/>
+      <w:r>
+        <w:rPr>
+          <w:sz w:val="20"/>
+          <w:szCs w:val="20"/>
+        </w:rPr>
+        <w:t>write</w:t>
+      </w:r>
+      <w:proofErr w:type="spellEnd"/>
+      <w:r>
+        <w:rPr>
+          <w:sz w:val="20"/>
+          <w:szCs w:val="20"/>
+        </w:rPr>
+        <w:t xml:space="preserve"> auf alles, </w:t>
+      </w:r>
+      <w:proofErr w:type="gramStart"/>
+      <w:r>
+        <w:rPr>
+          <w:sz w:val="20"/>
+          <w:szCs w:val="20"/>
+        </w:rPr>
+        <w:t>Normal</w:t>
+      </w:r>
+      <w:proofErr w:type="gramEnd"/>
+      <w:r>
+        <w:rPr>
+          <w:sz w:val="20"/>
+          <w:szCs w:val="20"/>
+        </w:rPr>
+        <w:t xml:space="preserve">: Access nur auf Views und </w:t>
+      </w:r>
+      <w:proofErr w:type="spellStart"/>
+      <w:r>
+        <w:rPr>
+          <w:sz w:val="20"/>
+          <w:szCs w:val="20"/>
+        </w:rPr>
+        <w:t>Procedures</w:t>
+      </w:r>
+      <w:proofErr w:type="spellEnd"/>
+      <w:r>
+        <w:rPr>
+          <w:sz w:val="20"/>
+          <w:szCs w:val="20"/>
+        </w:rPr>
+        <w:t>) definieren.</w:t>
       </w:r>
     </w:p>
     <w:p>
@@ -5665,7 +6259,23 @@
           <w:sz w:val="20"/>
           <w:szCs w:val="20"/>
         </w:rPr>
-        <w:t>Folgende DML Befehle aus Python ausführen lassen:</w:t>
+        <w:t xml:space="preserve">Folgende </w:t>
+      </w:r>
+      <w:proofErr w:type="gramStart"/>
+      <w:r>
+        <w:rPr>
+          <w:sz w:val="20"/>
+          <w:szCs w:val="20"/>
+        </w:rPr>
+        <w:t>DML Befehle</w:t>
+      </w:r>
+      <w:proofErr w:type="gramEnd"/>
+      <w:r>
+        <w:rPr>
+          <w:sz w:val="20"/>
+          <w:szCs w:val="20"/>
+        </w:rPr>
+        <w:t xml:space="preserve"> aus Python ausführen lassen:</w:t>
       </w:r>
     </w:p>
     <w:p>
@@ -5681,12 +6291,53 @@
           <w:szCs w:val="20"/>
         </w:rPr>
       </w:pPr>
-      <w:r>
-        <w:rPr>
-          <w:sz w:val="20"/>
-          <w:szCs w:val="20"/>
-        </w:rPr>
-        <w:t>select, insert, function auf eine Tabelle und eine View</w:t>
+      <w:proofErr w:type="spellStart"/>
+      <w:r>
+        <w:rPr>
+          <w:sz w:val="20"/>
+          <w:szCs w:val="20"/>
+        </w:rPr>
+        <w:t>select</w:t>
+      </w:r>
+      <w:proofErr w:type="spellEnd"/>
+      <w:r>
+        <w:rPr>
+          <w:sz w:val="20"/>
+          <w:szCs w:val="20"/>
+        </w:rPr>
+        <w:t xml:space="preserve">, </w:t>
+      </w:r>
+      <w:proofErr w:type="spellStart"/>
+      <w:r>
+        <w:rPr>
+          <w:sz w:val="20"/>
+          <w:szCs w:val="20"/>
+        </w:rPr>
+        <w:t>insert</w:t>
+      </w:r>
+      <w:proofErr w:type="spellEnd"/>
+      <w:r>
+        <w:rPr>
+          <w:sz w:val="20"/>
+          <w:szCs w:val="20"/>
+        </w:rPr>
+        <w:t xml:space="preserve">, </w:t>
+      </w:r>
+      <w:proofErr w:type="spellStart"/>
+      <w:r>
+        <w:rPr>
+          <w:sz w:val="20"/>
+          <w:szCs w:val="20"/>
+        </w:rPr>
+        <w:t>function</w:t>
+      </w:r>
+      <w:proofErr w:type="spellEnd"/>
+      <w:r>
+        <w:rPr>
+          <w:sz w:val="20"/>
+          <w:szCs w:val="20"/>
+        </w:rPr>
+        <w:t xml:space="preserve"> auf eine Tabelle und eine View</w:t>
       </w:r>
     </w:p>
     <w:p>
@@ -5702,13 +6353,31 @@
           <w:szCs w:val="20"/>
         </w:rPr>
       </w:pPr>
-      <w:r>
-        <w:rPr>
-          <w:sz w:val="20"/>
-          <w:szCs w:val="20"/>
-        </w:rPr>
-        <w:t>call Storded-Procedures</w:t>
-      </w:r>
+      <w:proofErr w:type="spellStart"/>
+      <w:r>
+        <w:rPr>
+          <w:sz w:val="20"/>
+          <w:szCs w:val="20"/>
+        </w:rPr>
+        <w:t>call</w:t>
+      </w:r>
+      <w:proofErr w:type="spellEnd"/>
+      <w:r>
+        <w:rPr>
+          <w:sz w:val="20"/>
+          <w:szCs w:val="20"/>
+        </w:rPr>
+        <w:t xml:space="preserve"> </w:t>
+      </w:r>
+      <w:proofErr w:type="spellStart"/>
+      <w:r>
+        <w:rPr>
+          <w:sz w:val="20"/>
+          <w:szCs w:val="20"/>
+        </w:rPr>
+        <w:t>Storded-Procedures</w:t>
+      </w:r>
+      <w:proofErr w:type="spellEnd"/>
     </w:p>
     <w:p>
       <w:pPr>
@@ -5884,23 +6553,7 @@
                 <w:sz w:val="20"/>
                 <w:szCs w:val="20"/>
               </w:rPr>
-              <w:t>17</w:t>
-            </w:r>
-            <w:r>
-              <w:rPr>
-                <w:rFonts w:cs="Arial"/>
-                <w:sz w:val="20"/>
-                <w:szCs w:val="20"/>
-              </w:rPr>
-              <w:t>.6.202</w:t>
-            </w:r>
-            <w:r>
-              <w:rPr>
-                <w:rFonts w:cs="Arial"/>
-                <w:sz w:val="20"/>
-                <w:szCs w:val="20"/>
-              </w:rPr>
-              <w:t>5</w:t>
+              <w:t>30.6.2026</w:t>
             </w:r>
           </w:p>
         </w:tc>
@@ -5970,34 +6623,7 @@
                 <w:sz w:val="20"/>
                 <w:szCs w:val="20"/>
               </w:rPr>
-              <w:t>1</w:t>
-            </w:r>
-            <w:r>
-              <w:rPr>
-                <w:rFonts w:cs="Arial"/>
-                <w:b/>
-                <w:sz w:val="20"/>
-                <w:szCs w:val="20"/>
-              </w:rPr>
-              <w:t>7:30</w:t>
-            </w:r>
-            <w:r>
-              <w:rPr>
-                <w:rFonts w:cs="Arial"/>
-                <w:b/>
-                <w:sz w:val="20"/>
-                <w:szCs w:val="20"/>
-              </w:rPr>
-              <w:t xml:space="preserve"> – </w:t>
-            </w:r>
-            <w:r>
-              <w:rPr>
-                <w:rFonts w:cs="Arial"/>
-                <w:b/>
-                <w:sz w:val="20"/>
-                <w:szCs w:val="20"/>
-              </w:rPr>
-              <w:t>20:45</w:t>
+              <w:t>09:00 – 12:15</w:t>
             </w:r>
           </w:p>
         </w:tc>
@@ -6037,13 +6663,23 @@
           <w:szCs w:val="20"/>
         </w:rPr>
       </w:pPr>
+      <w:proofErr w:type="spellStart"/>
       <w:r>
         <w:rPr>
           <w:color w:val="auto"/>
           <w:sz w:val="20"/>
           <w:szCs w:val="20"/>
         </w:rPr>
-        <w:t>Moodle-Prüfung: Zeit 3h</w:t>
+        <w:t>Moodle</w:t>
+      </w:r>
+      <w:proofErr w:type="spellEnd"/>
+      <w:r>
+        <w:rPr>
+          <w:color w:val="auto"/>
+          <w:sz w:val="20"/>
+          <w:szCs w:val="20"/>
+        </w:rPr>
+        <w:t>-Prüfung: Zeit 3h</w:t>
       </w:r>
     </w:p>
     <w:p>
@@ -6066,7 +6702,25 @@
           <w:sz w:val="20"/>
           <w:szCs w:val="20"/>
         </w:rPr>
-        <w:t>DDL und DML Befehle in allen Varianten</w:t>
+        <w:t xml:space="preserve">DDL und </w:t>
+      </w:r>
+      <w:proofErr w:type="gramStart"/>
+      <w:r>
+        <w:rPr>
+          <w:color w:val="auto"/>
+          <w:sz w:val="20"/>
+          <w:szCs w:val="20"/>
+        </w:rPr>
+        <w:t>DML Befehle</w:t>
+      </w:r>
+      <w:proofErr w:type="gramEnd"/>
+      <w:r>
+        <w:rPr>
+          <w:color w:val="auto"/>
+          <w:sz w:val="20"/>
+          <w:szCs w:val="20"/>
+        </w:rPr>
+        <w:t xml:space="preserve"> in allen Varianten</w:t>
       </w:r>
     </w:p>
     <w:p>
@@ -6083,14 +6737,34 @@
           <w:szCs w:val="20"/>
         </w:rPr>
       </w:pPr>
+      <w:proofErr w:type="spellStart"/>
       <w:r>
         <w:rPr>
           <w:color w:val="auto"/>
           <w:sz w:val="20"/>
           <w:szCs w:val="20"/>
         </w:rPr>
-        <w:t>Functions und Stored-Procedures</w:t>
-      </w:r>
+        <w:t>Functions</w:t>
+      </w:r>
+      <w:proofErr w:type="spellEnd"/>
+      <w:r>
+        <w:rPr>
+          <w:color w:val="auto"/>
+          <w:sz w:val="20"/>
+          <w:szCs w:val="20"/>
+        </w:rPr>
+        <w:t xml:space="preserve"> und </w:t>
+      </w:r>
+      <w:proofErr w:type="spellStart"/>
+      <w:r>
+        <w:rPr>
+          <w:color w:val="auto"/>
+          <w:sz w:val="20"/>
+          <w:szCs w:val="20"/>
+        </w:rPr>
+        <w:t>Stored-Procedures</w:t>
+      </w:r>
+      <w:proofErr w:type="spellEnd"/>
     </w:p>
     <w:p>
       <w:pPr>
@@ -6135,8 +6809,36 @@
           <w:sz w:val="20"/>
           <w:szCs w:val="20"/>
         </w:rPr>
-        <w:t>Python Access DML und DDL, sowie Stored-Procedures calls</w:t>
-      </w:r>
+        <w:t xml:space="preserve">Python Access DML und DDL, sowie </w:t>
+      </w:r>
+      <w:proofErr w:type="spellStart"/>
+      <w:r>
+        <w:rPr>
+          <w:color w:val="auto"/>
+          <w:sz w:val="20"/>
+          <w:szCs w:val="20"/>
+        </w:rPr>
+        <w:t>Stored-Procedures</w:t>
+      </w:r>
+      <w:proofErr w:type="spellEnd"/>
+      <w:r>
+        <w:rPr>
+          <w:color w:val="auto"/>
+          <w:sz w:val="20"/>
+          <w:szCs w:val="20"/>
+        </w:rPr>
+        <w:t xml:space="preserve"> </w:t>
+      </w:r>
+      <w:proofErr w:type="spellStart"/>
+      <w:r>
+        <w:rPr>
+          <w:color w:val="auto"/>
+          <w:sz w:val="20"/>
+          <w:szCs w:val="20"/>
+        </w:rPr>
+        <w:t>calls</w:t>
+      </w:r>
+      <w:proofErr w:type="spellEnd"/>
     </w:p>
     <w:p>
       <w:pPr>
@@ -6205,10 +6907,7 @@
       <w:pStyle w:val="Fuzeile"/>
     </w:pPr>
     <w:r>
-      <w:t>27.2.202</w:t>
-    </w:r>
-    <w:r>
-      <w:t>5</w:t>
+      <w:t>1.3.2025</w:t>
     </w:r>
     <w:r>
       <w:tab/>
@@ -16366,12 +17065,9 @@
 </file>
 
 <file path=customXml/item1.xml><?xml version="1.0" encoding="utf-8"?>
-<?mso-contentType ?>
-<FormTemplates xmlns="http://schemas.microsoft.com/sharepoint/v3/contenttype/forms">
-  <Display>DocumentLibraryForm</Display>
-  <Edit>DocumentLibraryForm</Edit>
-  <New>DocumentLibraryForm</New>
-</FormTemplates>
+<p:properties xmlns:p="http://schemas.microsoft.com/office/2006/metadata/properties" xmlns:xsi="http://www.w3.org/2001/XMLSchema-instance" xmlns:pc="http://schemas.microsoft.com/office/infopath/2007/PartnerControls">
+  <documentManagement/>
+</p:properties>
 </file>
 
 <file path=customXml/item2.xml><?xml version="1.0" encoding="utf-8"?>
@@ -16578,15 +17274,19 @@
 </file>
 
 <file path=customXml/item3.xml><?xml version="1.0" encoding="utf-8"?>
-<p:properties xmlns:p="http://schemas.microsoft.com/office/2006/metadata/properties" xmlns:xsi="http://www.w3.org/2001/XMLSchema-instance" xmlns:pc="http://schemas.microsoft.com/office/infopath/2007/PartnerControls">
-  <documentManagement/>
-</p:properties>
+<?mso-contentType ?>
+<FormTemplates xmlns="http://schemas.microsoft.com/sharepoint/v3/contenttype/forms">
+  <Display>DocumentLibraryForm</Display>
+  <Edit>DocumentLibraryForm</Edit>
+  <New>DocumentLibraryForm</New>
+</FormTemplates>
 </file>
 
 <file path=customXml/itemProps1.xml><?xml version="1.0" encoding="utf-8"?>
-<ds:datastoreItem xmlns:ds="http://schemas.openxmlformats.org/officeDocument/2006/customXml" ds:itemID="{82F971DC-432E-4E50-939B-6C31B46B7B33}">
+<ds:datastoreItem xmlns:ds="http://schemas.openxmlformats.org/officeDocument/2006/customXml" ds:itemID="{19B06714-4048-46F0-A4BC-D394CCE0DE93}">
   <ds:schemaRefs>
-    <ds:schemaRef ds:uri="http://schemas.microsoft.com/sharepoint/v3/contenttype/forms"/>
+    <ds:schemaRef ds:uri="http://schemas.microsoft.com/office/2006/metadata/properties"/>
+    <ds:schemaRef ds:uri="http://schemas.microsoft.com/office/infopath/2007/PartnerControls"/>
   </ds:schemaRefs>
 </ds:datastoreItem>
 </file>
@@ -16611,10 +17311,9 @@
 </file>
 
 <file path=customXml/itemProps3.xml><?xml version="1.0" encoding="utf-8"?>
-<ds:datastoreItem xmlns:ds="http://schemas.openxmlformats.org/officeDocument/2006/customXml" ds:itemID="{19B06714-4048-46F0-A4BC-D394CCE0DE93}">
+<ds:datastoreItem xmlns:ds="http://schemas.openxmlformats.org/officeDocument/2006/customXml" ds:itemID="{82F971DC-432E-4E50-939B-6C31B46B7B33}">
   <ds:schemaRefs>
-    <ds:schemaRef ds:uri="http://schemas.microsoft.com/office/2006/metadata/properties"/>
-    <ds:schemaRef ds:uri="http://schemas.microsoft.com/office/infopath/2007/PartnerControls"/>
+    <ds:schemaRef ds:uri="http://schemas.microsoft.com/sharepoint/v3/contenttype/forms"/>
   </ds:schemaRefs>
 </ds:datastoreItem>
 </file>
</xml_diff>